<commit_message>
feat(app): create next project with prisma
</commit_message>
<xml_diff>
--- a/Doc/TPI_Rapport_Candidat_Canevas_2026.docx
+++ b/Doc/TPI_Rapport_Candidat_Canevas_2026.docx
@@ -91,6 +91,7 @@
           <w:b/>
           <w:i/>
           <w:iCs/>
+          <w:noProof/>
           <w:color w:val="BFBFBF" w:themeColor="background1" w:themeShade="BF"/>
           <w:sz w:val="32"/>
         </w:rPr>
@@ -453,6 +454,7 @@
           </w:tcPr>
           <w:p>
             <w:r>
+              <w:lastRenderedPageBreak/>
               <w:t>Version du rapport</w:t>
             </w:r>
           </w:p>
@@ -2746,8 +2748,21 @@
       <w:pPr>
         <w:pStyle w:val="Heading2Simple"/>
         <w:rPr>
+          <w:noProof/>
           <w:lang w:val="fr-FR"/>
         </w:rPr>
+        <w:sectPr>
+          <w:headerReference w:type="default" r:id="rId12"/>
+          <w:footerReference w:type="even" r:id="rId13"/>
+          <w:footerReference w:type="default" r:id="rId14"/>
+          <w:headerReference w:type="first" r:id="rId15"/>
+          <w:footerReference w:type="first" r:id="rId16"/>
+          <w:pgSz w:w="12240" w:h="15840"/>
+          <w:pgMar w:top="1386" w:right="1417" w:bottom="618" w:left="1417" w:header="720" w:footer="188" w:gutter="0"/>
+          <w:cols w:space="720"/>
+          <w:titlePg/>
+          <w:docGrid w:linePitch="360"/>
+        </w:sectPr>
       </w:pPr>
       <w:r>
         <w:rPr>
@@ -2774,14 +2789,100 @@
         </w:rPr>
         <w:fldChar w:fldCharType="separate"/>
       </w:r>
-      <w:r>
+    </w:p>
+    <w:p>
+      <w:pPr>
+        <w:pStyle w:val="Titreindex"/>
+        <w:keepNext/>
+        <w:tabs>
+          <w:tab w:val="right" w:pos="9396"/>
+        </w:tabs>
         <w:rPr>
           <w:b w:val="0"/>
+          <w:bCs w:val="0"/>
+          <w:noProof/>
+        </w:rPr>
+      </w:pPr>
+      <w:r>
+        <w:rPr>
+          <w:noProof/>
+        </w:rPr>
+        <w:t>W</w:t>
+      </w:r>
+    </w:p>
+    <w:p>
+      <w:pPr>
+        <w:pStyle w:val="Index1"/>
+        <w:tabs>
+          <w:tab w:val="right" w:pos="9396"/>
+        </w:tabs>
+        <w:rPr>
+          <w:noProof/>
+        </w:rPr>
+      </w:pPr>
+      <w:r>
+        <w:rPr>
+          <w:noProof/>
+        </w:rPr>
+        <w:t>Waterfall</w:t>
+      </w:r>
+    </w:p>
+    <w:p>
+      <w:pPr>
+        <w:pStyle w:val="Index2"/>
+        <w:tabs>
+          <w:tab w:val="right" w:pos="9396"/>
+        </w:tabs>
+        <w:rPr>
           <w:bCs/>
+          <w:noProof/>
+        </w:rPr>
+      </w:pPr>
+      <w:r>
+        <w:rPr>
+          <w:noProof/>
+        </w:rPr>
+        <w:t>La méthode de gestion de projet Waterfall (ou « en cascade ») est une approche linéaire et séquentielle où chaque phase doit être finalisée avant de passer à la suivante. Idéal pour des projets aux exigences fixes et claires, ce modèle rigoureux planifie tout dès le départ, facilitant la gestion budgétaire et le délais.</w:t>
+      </w:r>
+      <w:r>
+        <w:rPr>
+          <w:noProof/>
+        </w:rPr>
+        <w:tab/>
+      </w:r>
+      <w:r>
+        <w:rPr>
+          <w:b/>
+          <w:bCs/>
+          <w:noProof/>
+        </w:rPr>
+        <w:t>5</w:t>
+      </w:r>
+    </w:p>
+    <w:p>
+      <w:pPr>
+        <w:pStyle w:val="Heading2Simple"/>
+        <w:rPr>
+          <w:noProof/>
           <w:lang w:val="fr-FR"/>
         </w:rPr>
-        <w:t>Aucune entrée d'index n'a été trouvée.</w:t>
-      </w:r>
+        <w:sectPr>
+          <w:type w:val="continuous"/>
+          <w:pgSz w:w="12240" w:h="15840"/>
+          <w:pgMar w:top="1386" w:right="1417" w:bottom="618" w:left="1417" w:header="720" w:footer="188" w:gutter="0"/>
+          <w:cols w:space="720"/>
+          <w:titlePg/>
+          <w:docGrid w:linePitch="360"/>
+        </w:sectPr>
+      </w:pPr>
+    </w:p>
+    <w:p>
+      <w:pPr>
+        <w:pStyle w:val="Heading2Simple"/>
+        <w:rPr>
+          <w:lang w:val="fr-FR"/>
+        </w:rPr>
+      </w:pPr>
       <w:r>
         <w:rPr>
           <w:lang w:val="fr-FR"/>
@@ -2824,13 +2925,7 @@
     </w:p>
     <w:p>
       <w:r>
-        <w:t xml:space="preserve">Le projet s’inscrit dans le cadre du travail pratique individuel (TPI) de fin de formation. Le mandat </w:t>
-      </w:r>
-      <w:r>
-        <w:t>a</w:t>
-      </w:r>
-      <w:r>
-        <w:t xml:space="preserve"> été défini et approuvé par le chef de projet Jonathan Melly</w:t>
+        <w:t>Le projet s’inscrit dans le cadre du travail pratique individuel (TPI) de fin de formation. Le mandat a été défini et approuvé par le chef de projet Jonathan Melly</w:t>
       </w:r>
       <w:r>
         <w:t xml:space="preserve"> ainsi que les experts</w:t>
@@ -2870,12 +2965,36 @@
     </w:p>
     <w:p>
       <w:r>
-        <w:t>Le projet repose sur une architecture web moderne basée sur JavaScript et Node.js, avec une base de données MariaDB. L’application s’interfacera avec une API d’envoi d’emails existante, utilisant la fonction native mail() de PHP. L’envoi des campagnes devra obligatoirement s’effectuer de manière asynchrone via un système de file d’attente et un processus de relais, afin d’assurer la robustesse du système et la maîtrise des envois en masse.</w:t>
+        <w:t xml:space="preserve">Le projet repose sur une architecture web moderne basée sur JavaScript et Node.js, avec une base de données </w:t>
+      </w:r>
+      <w:proofErr w:type="spellStart"/>
+      <w:r>
+        <w:t>MariaDB</w:t>
+      </w:r>
+      <w:proofErr w:type="spellEnd"/>
+      <w:r>
+        <w:t xml:space="preserve">. L’application s’interfacera avec une API d’envoi </w:t>
+      </w:r>
+      <w:proofErr w:type="gramStart"/>
+      <w:r>
+        <w:t>d’emails</w:t>
+      </w:r>
+      <w:proofErr w:type="gramEnd"/>
+      <w:r>
+        <w:t xml:space="preserve"> existante, utilisant la fonction native mail() de PHP. L’envoi des campagnes devra obligatoirement s’effectuer de manière asynchrone via un système de file d’attente et un processus de relais, afin d’assurer la robustesse du système et la maîtrise des envois en masse.</w:t>
       </w:r>
     </w:p>
     <w:p>
       <w:r>
-        <w:t>Le projet poursuit plusieurs objectifs principaux, mesurables et datés. L’application devra permettre l’authentification sécurisée des administrateurs ainsi qu’une gestion stricte des rôles selon le principe du moindre privilège. Elle devra offrir un formulaire public d’inscription conforme aux exigences de la LPD, incluant le consentement explicite des abonnés, ainsi qu’un mécanisme de désinscription reposant sur des tokens uniques et sécurisés.</w:t>
+        <w:t xml:space="preserve">Le projet poursuit plusieurs objectifs principaux, mesurables et datés. L’application devra permettre l’authentification sécurisée des administrateurs ainsi qu’une gestion stricte des rôles selon le principe du moindre privilège. Elle devra offrir un formulaire public d’inscription conforme aux exigences de la LPD, incluant le consentement explicite des abonnés, ainsi qu’un mécanisme de désinscription reposant sur des </w:t>
+      </w:r>
+      <w:proofErr w:type="spellStart"/>
+      <w:r>
+        <w:t>tokens</w:t>
+      </w:r>
+      <w:proofErr w:type="spellEnd"/>
+      <w:r>
+        <w:t xml:space="preserve"> uniques et sécurisés.</w:t>
       </w:r>
     </w:p>
     <w:p>
@@ -2888,33 +3007,35 @@
         <w:rPr>
           <w:lang w:val="fr-CH"/>
         </w:rPr>
-        <w:t>L’outil devra également permettre la création de campagnes en format Markdown, leur planification, leur mise en file d’attente et leur envoi par lots. Chaque campagne suivra un cycle de vie clairement défini : brouillon, planifiée, en cours, terminée ou échouée. Un système de suivi devra mesurer les performances des campagnes grâce au tracking des ouvertures via un pixel invisible et au suivi des clics par réécriture dynamique des liens.</w:t>
-      </w:r>
-    </w:p>
-    <w:p>
-      <w:pPr>
+        <w:t xml:space="preserve">L’outil devra également permettre la création de campagnes en format </w:t>
+      </w:r>
+      <w:proofErr w:type="spellStart"/>
+      <w:r>
         <w:rPr>
           <w:lang w:val="fr-CH"/>
         </w:rPr>
-      </w:pPr>
+        <w:t>Markdown</w:t>
+      </w:r>
+      <w:proofErr w:type="spellEnd"/>
       <w:r>
         <w:rPr>
           <w:lang w:val="fr-CH"/>
         </w:rPr>
-        <w:t>L’API et l’application devront garantir un haut niveau de sécurité. Les données personnelles devront être protégées, les tokens invalides ou expirés rejetés, et aucune vulnérabilité critique, notamment liée aux injections ou aux accès non autorisés, ne devra être présente. Une attention particulière sera portée à la conformité légale, à la protection des données et à la justification des mesures de sécurité mises en œuvre.</w:t>
-      </w:r>
-    </w:p>
-    <w:p>
-      <w:pPr>
+        <w:t xml:space="preserve">, leur planification, leur mise en file d’attente et leur envoi par lots. Chaque campagne suivra un cycle de vie clairement défini : brouillon, planifiée, en cours, terminée ou échouée. Un système de suivi devra mesurer les performances des campagnes grâce au </w:t>
+      </w:r>
+      <w:proofErr w:type="spellStart"/>
+      <w:r>
         <w:rPr>
           <w:lang w:val="fr-CH"/>
         </w:rPr>
-      </w:pPr>
+        <w:t>tracking</w:t>
+      </w:r>
+      <w:proofErr w:type="spellEnd"/>
       <w:r>
         <w:rPr>
           <w:lang w:val="fr-CH"/>
         </w:rPr>
-        <w:t>Le candidat s’engage à fournir l’ensemble des livrables suivants au chef de projet et aux deux experts à l’échéance du TPI. Le code source complet sera déposé sur un dépôt Git distant et versionné par des commits réguliers. Il sera accompagné d’une documentation d’installation, de configuration et d’utilisation.</w:t>
+        <w:t xml:space="preserve"> des ouvertures via un pixel invisible et au suivi des clics par réécriture dynamique des liens.</w:t>
       </w:r>
     </w:p>
     <w:p>
@@ -2923,6 +3044,60 @@
           <w:lang w:val="fr-CH"/>
         </w:rPr>
       </w:pPr>
+      <w:r>
+        <w:rPr>
+          <w:lang w:val="fr-CH"/>
+        </w:rPr>
+        <w:t xml:space="preserve">L’API et l’application devront garantir un haut niveau de sécurité. Les données personnelles devront être protégées, les </w:t>
+      </w:r>
+      <w:proofErr w:type="spellStart"/>
+      <w:r>
+        <w:rPr>
+          <w:lang w:val="fr-CH"/>
+        </w:rPr>
+        <w:t>tokens</w:t>
+      </w:r>
+      <w:proofErr w:type="spellEnd"/>
+      <w:r>
+        <w:rPr>
+          <w:lang w:val="fr-CH"/>
+        </w:rPr>
+        <w:t xml:space="preserve"> invalides ou expirés rejetés, et aucune vulnérabilité critique, notamment liée aux injections ou aux accès non autorisés, ne devra être présente. Une attention particulière sera portée à la conformité légale, à la protection des données et à la justification des mesures de sécurité mises en œuvre.</w:t>
+      </w:r>
+    </w:p>
+    <w:p>
+      <w:pPr>
+        <w:rPr>
+          <w:lang w:val="fr-CH"/>
+        </w:rPr>
+      </w:pPr>
+      <w:r>
+        <w:rPr>
+          <w:lang w:val="fr-CH"/>
+        </w:rPr>
+        <w:t xml:space="preserve">Le candidat s’engage à fournir l’ensemble des livrables suivants au chef de projet et aux deux experts à l’échéance du TPI. Le code source complet sera déposé sur un dépôt Git distant et versionné par des </w:t>
+      </w:r>
+      <w:proofErr w:type="spellStart"/>
+      <w:r>
+        <w:rPr>
+          <w:lang w:val="fr-CH"/>
+        </w:rPr>
+        <w:t>commits</w:t>
+      </w:r>
+      <w:proofErr w:type="spellEnd"/>
+      <w:r>
+        <w:rPr>
+          <w:lang w:val="fr-CH"/>
+        </w:rPr>
+        <w:t xml:space="preserve"> réguliers. Il sera accompagné d’une documentation d’installation, de configuration et d’utilisation.</w:t>
+      </w:r>
+    </w:p>
+    <w:p>
+      <w:pPr>
+        <w:rPr>
+          <w:lang w:val="fr-CH"/>
+        </w:rPr>
+      </w:pPr>
     </w:p>
     <w:p>
       <w:pPr>
@@ -2937,45 +3112,115 @@
     </w:p>
     <w:p>
       <w:r>
-        <w:t>Pour la gestion de ce projet il a été décidé d’utiliser la méthode "Waterfall". Ce choix se justifie avant tout parce que le cahier des charges a été remis de façon complète et définitive dès le premier jour sans possibilité de modification en cours de réalisation. Les fonctionnalités attendues, les contraintes techniques et les livrables étaient donc clairement définis et stables dès le départ, ce qui correspond précisément au contexte dans lequel la méthode Waterfall s'applique le mieux.</w:t>
+        <w:t>Pour la gestion de ce projet il a été décidé d’utiliser la méthode "Waterfall</w:t>
+      </w:r>
+      <w:r>
+        <w:fldChar w:fldCharType="begin"/>
+      </w:r>
+      <w:r>
+        <w:instrText xml:space="preserve"> XE "</w:instrText>
+      </w:r>
+      <w:r>
+        <w:instrText>Waterfall:</w:instrText>
+      </w:r>
+      <w:r>
+        <w:instrText xml:space="preserve">La méthode de gestion de projet Waterfall (ou </w:instrText>
+      </w:r>
+      <w:r>
+        <w:rPr>
+          <w:rFonts w:asciiTheme="minorHAnsi" w:hAnsiTheme="minorHAnsi"/>
+          <w:kern w:val="2"/>
+          <w:sz w:val="24"/>
+          <w:szCs w:val="24"/>
+          <w:lang w:val="fr-CH" w:eastAsia="fr-CH"/>
+          <w14:ligatures w14:val="standardContextual"/>
+        </w:rPr>
+        <w:instrText>\</w:instrText>
+      </w:r>
+      <w:r>
+        <w:instrText xml:space="preserve">« en cascade </w:instrText>
+      </w:r>
+      <w:r>
+        <w:rPr>
+          <w:rFonts w:asciiTheme="minorHAnsi" w:hAnsiTheme="minorHAnsi"/>
+          <w:kern w:val="2"/>
+          <w:sz w:val="24"/>
+          <w:szCs w:val="24"/>
+          <w:lang w:val="fr-CH" w:eastAsia="fr-CH"/>
+          <w14:ligatures w14:val="standardContextual"/>
+        </w:rPr>
+        <w:instrText>\</w:instrText>
+      </w:r>
+      <w:r>
+        <w:instrText>») est une approche linéaire et séquentielle où chaque phase doit être finalisée avant de passer à la suivante. Idéal pour des projets aux exigences fixes et claires, ce modèle rigoureux planifie tout dès le départ, facilitant la gestion budgétaire et les délais.</w:instrText>
+      </w:r>
+      <w:r>
+        <w:instrText xml:space="preserve">" \b </w:instrText>
+      </w:r>
+      <w:r>
+        <w:fldChar w:fldCharType="end"/>
+      </w:r>
+      <w:r>
+        <w:t>". Ce choix se justifie avant tout parce que le cahier des charges a été remis de façon complète et définitive dès le premier jour sans possibilité de modification en cours de réalisation. Les fonctionnalités attendues, les contraintes techniques et les livrables étaient donc clairement définis et stables dès le départ, ce qui correspond précisément au contexte dans lequel la méthode Waterfall s'applique le mieux.</w:t>
       </w:r>
     </w:p>
     <w:p>
       <w:r>
-        <w:t xml:space="preserve">L’application </w:t>
-      </w:r>
-      <w:r>
-        <w:t>est</w:t>
-      </w:r>
-      <w:r>
-        <w:t xml:space="preserve"> versionné sur Github </w:t>
-      </w:r>
-      <w:r>
-        <w:t>(</w:t>
-      </w:r>
-      <w:hyperlink r:id="rId12" w:history="1">
+        <w:t xml:space="preserve">L’application est versionnée sur GitHub pour plusieurs raisons. La première concerne la sauvegarde du code et de la documentation, ce qui évite de dépendre d’un seul ordinateur. La seconde, et la principale, est la traçabilité </w:t>
+      </w:r>
+      <w:r>
+        <w:t xml:space="preserve">car </w:t>
+      </w:r>
+      <w:r>
+        <w:t>elle permet de suivre l’évolution du projet et de revenir à une version antérieure à tout moment.</w:t>
+      </w:r>
+    </w:p>
+    <w:p>
+      <w:r>
+        <w:t>Bien que cela ne constitue pas une pratique recommandée, certains fichiers binaires, tels que le rapport et le journal de travail, ont également été intégrés au dépôt. En effet, les systèmes de gestion de versions sont avant tout conçus pour les fichiers texte, sur lesquels ils peuvent suivre précisément les modifications. Toutefois, dans le cadre de ce projet, ce choix permet de centraliser l’ensemble des livrables au même endroit et d’en assurer la sauvegarde ainsi que l’historique.</w:t>
+      </w:r>
+    </w:p>
+    <w:p>
+      <w:r>
+        <w:t xml:space="preserve">La planification a été réalisée avec un outil en ligne nommé </w:t>
+      </w:r>
+      <w:proofErr w:type="spellStart"/>
+      <w:r>
+        <w:t>onlinegantt</w:t>
+      </w:r>
+      <w:proofErr w:type="spellEnd"/>
+      <w:r>
+        <w:t xml:space="preserve"> (</w:t>
+      </w:r>
+      <w:hyperlink r:id="rId17" w:history="1">
         <w:r>
           <w:rPr>
             <w:rStyle w:val="Lienhypertexte"/>
           </w:rPr>
-          <w:t>https://github.com/ThomNardou/Agora</w:t>
+          <w:t>https://www.onlinegantt.com/#/gantt</w:t>
         </w:r>
       </w:hyperlink>
       <w:r>
-        <w:t>) pour plusieurs raison : la première concerne la sauvegarde d</w:t>
-      </w:r>
-      <w:r>
-        <w:t>u</w:t>
-      </w:r>
-      <w:r>
-        <w:t xml:space="preserve"> code et de la documentation car cela évite de dépendre uniquement d’un ordinateur. La deuxième et la principale c’est la traçabilité qui permet de suivre l’avancée de </w:t>
-      </w:r>
-      <w:r>
-        <w:t>du</w:t>
-      </w:r>
-      <w:r>
-        <w:t xml:space="preserve"> projet et de pouvoir revenir en arrière à tout moment. </w:t>
-      </w:r>
+        <w:t xml:space="preserve">) qui est un outil gratuit permettant la création de digramme de </w:t>
+      </w:r>
+      <w:proofErr w:type="spellStart"/>
+      <w:r>
+        <w:t>gantt</w:t>
+      </w:r>
+      <w:proofErr w:type="spellEnd"/>
+      <w:r>
+        <w:t xml:space="preserve"> permettant une planification plus structurée et visuelle.</w:t>
+      </w:r>
+    </w:p>
+    <w:p>
+      <w:pPr>
+        <w:pStyle w:val="Titre2"/>
+      </w:pPr>
+      <w:bookmarkStart w:id="3" w:name="_Toc223007763"/>
+      <w:r>
+        <w:t>Analyse des exigences</w:t>
+      </w:r>
+      <w:bookmarkEnd w:id="3"/>
     </w:p>
     <w:p>
       <w:pPr>
@@ -3006,19 +3251,7 @@
         </w:numPr>
       </w:pPr>
       <w:r>
-        <w:t>Méthode de gestion de projet (p.</w:t>
-      </w:r>
-      <w:r>
-        <w:t xml:space="preserve"> </w:t>
-      </w:r>
-      <w:r>
-        <w:t xml:space="preserve">ex. </w:t>
-      </w:r>
-      <w:r>
-        <w:t xml:space="preserve">Waterfall, </w:t>
-      </w:r>
-      <w:r>
-        <w:t>cycle en V, itératif/agile) et justification</w:t>
+        <w:t>Exigences fonctionnelles et non fonctionnelles (qualité, performance, sécurité, UX)</w:t>
       </w:r>
     </w:p>
     <w:p>
@@ -3030,7 +3263,7 @@
         </w:numPr>
       </w:pPr>
       <w:r>
-        <w:t>Organisation (rôles, responsabilités, communication)</w:t>
+        <w:t>Hypothèses et contraintes</w:t>
       </w:r>
     </w:p>
     <w:p>
@@ -3042,13 +3275,7 @@
         </w:numPr>
       </w:pPr>
       <w:r>
-        <w:t xml:space="preserve">Outils (gestion de versions, suivi </w:t>
-      </w:r>
-      <w:r>
-        <w:t xml:space="preserve">de </w:t>
-      </w:r>
-      <w:r>
-        <w:t>tâches, CI, documentation)</w:t>
+        <w:t>Cas d'utilisation / user stories (si pertinent)</w:t>
       </w:r>
     </w:p>
     <w:p>
@@ -3061,34 +3288,63 @@
         <w:t>À rédiger…</w:t>
       </w:r>
     </w:p>
-    <w:p/>
     <w:p>
       <w:pPr>
         <w:pStyle w:val="Titre2"/>
       </w:pPr>
-      <w:bookmarkStart w:id="3" w:name="_Toc223007763"/>
-      <w:r>
-        <w:t>Analyse des exigences</w:t>
-      </w:r>
-      <w:bookmarkEnd w:id="3"/>
+      <w:bookmarkStart w:id="4" w:name="_Toc223007764"/>
+      <w:r>
+        <w:t>Gestion des risques et mesures</w:t>
+      </w:r>
+      <w:bookmarkEnd w:id="4"/>
     </w:p>
     <w:p>
+      <w:r>
+        <w:t xml:space="preserve">Plusieurs risques ont été identifiés comme </w:t>
+      </w:r>
+      <w:r>
+        <w:t xml:space="preserve">une découverte tardive de failles de sécurité, notamment au niveau de l’authentification ou de la validation des données, pourrait nécessiter des corrections importantes en fin de projet et avoir un impact sur le planning. De plus, certaines tâches peuvent s’avérer plus complexes qu’initialement estimé, ce qui pourrait </w:t>
+      </w:r>
+      <w:r>
+        <w:t>perturber</w:t>
+      </w:r>
+      <w:r>
+        <w:t xml:space="preserve"> l’avancement global du projet. Enfin, la disponibilité limitée du chef de projet ou des </w:t>
+      </w:r>
+      <w:r>
+        <w:t>experts</w:t>
+      </w:r>
+      <w:r>
+        <w:t xml:space="preserve"> peut ralentir la prise de décision et la validation de certains choix techniques</w:t>
+      </w:r>
+      <w:r>
+        <w:t>/</w:t>
+      </w:r>
+      <w:r>
+        <w:t>fonctionnels</w:t>
+      </w:r>
+      <w:r>
+        <w:t xml:space="preserve"> ou simplement des réponses à des questions bloquantes.</w:t>
+      </w:r>
+    </w:p>
+    <w:p>
+      <w:pPr>
+        <w:pStyle w:val="Titre2"/>
+      </w:pPr>
+      <w:bookmarkStart w:id="5" w:name="_Toc223007765"/>
+      <w:r>
+        <w:t>Conception</w:t>
+      </w:r>
+      <w:bookmarkEnd w:id="5"/>
+    </w:p>
+    <w:p>
       <w:pPr>
         <w:pStyle w:val="Guidage"/>
-        <w:rPr>
-          <w:color w:val="808080" w:themeColor="background1" w:themeShade="80"/>
-        </w:rPr>
-      </w:pPr>
-      <w:r>
-        <w:rPr>
-          <w:color w:val="808080" w:themeColor="background1" w:themeShade="80"/>
-        </w:rPr>
+      </w:pPr>
+      <w:r>
         <w:t xml:space="preserve">Exemple </w:t>
       </w:r>
       <w:r>
-        <w:rPr>
-          <w:color w:val="808080" w:themeColor="background1" w:themeShade="80"/>
-        </w:rPr>
         <w:t>de contenu attendu :</w:t>
       </w:r>
     </w:p>
@@ -3101,7 +3357,7 @@
         </w:numPr>
       </w:pPr>
       <w:r>
-        <w:t>Exigences fonctionnelles et non fonctionnelles (qualité, performance, sécurité, UX)</w:t>
+        <w:t>Architecture (schéma de haut niveau)</w:t>
       </w:r>
     </w:p>
     <w:p>
@@ -3113,7 +3369,43 @@
         </w:numPr>
       </w:pPr>
       <w:r>
-        <w:t>Hypothèses et contraintes</w:t>
+        <w:t>Conception détaillée (</w:t>
+      </w:r>
+      <w:r>
+        <w:t>MCD</w:t>
+      </w:r>
+      <w:r>
+        <w:t xml:space="preserve">, </w:t>
+      </w:r>
+      <w:r>
+        <w:t>UML</w:t>
+      </w:r>
+      <w:r>
+        <w:t xml:space="preserve">, </w:t>
+      </w:r>
+      <w:r>
+        <w:t xml:space="preserve">schéma </w:t>
+      </w:r>
+      <w:r>
+        <w:t>fonctionnel</w:t>
+      </w:r>
+      <w:r>
+        <w:t>,</w:t>
+      </w:r>
+      <w:r>
+        <w:t xml:space="preserve"> API, maquettes UI</w:t>
+      </w:r>
+      <w:r>
+        <w:t>,</w:t>
+      </w:r>
+      <w:r>
+        <w:t xml:space="preserve"> </w:t>
+      </w:r>
+      <w:r>
+        <w:t>etc.</w:t>
+      </w:r>
+      <w:r>
+        <w:t>)</w:t>
       </w:r>
     </w:p>
     <w:p>
@@ -3125,7 +3417,29 @@
         </w:numPr>
       </w:pPr>
       <w:r>
-        <w:t>Cas d'utilisation / user stories (si pertinent)</w:t>
+        <w:t>Choix techniques et alternatives évaluées</w:t>
+      </w:r>
+    </w:p>
+    <w:p>
+      <w:pPr>
+        <w:pStyle w:val="GuidageList"/>
+        <w:numPr>
+          <w:ilvl w:val="0"/>
+          <w:numId w:val="0"/>
+        </w:numPr>
+      </w:pPr>
+      <w:r>
+        <w:lastRenderedPageBreak/>
+        <w:t>Sécurité : authentification, autorisations, gestion des secrets</w:t>
+      </w:r>
+      <w:r>
+        <w:t xml:space="preserve">, firewall, </w:t>
+      </w:r>
+      <w:r>
+        <w:t>protocole</w:t>
+      </w:r>
+      <w:r>
+        <w:t xml:space="preserve"> </w:t>
       </w:r>
     </w:p>
     <w:p>
@@ -3138,202 +3452,23 @@
         <w:t>À rédiger…</w:t>
       </w:r>
     </w:p>
-    <w:p/>
     <w:p>
       <w:pPr>
-        <w:pStyle w:val="Titre2"/>
-      </w:pPr>
-      <w:bookmarkStart w:id="4" w:name="_Toc223007764"/>
-      <w:r>
-        <w:t>Gestion des risques et mesures</w:t>
-      </w:r>
-      <w:bookmarkEnd w:id="4"/>
-    </w:p>
-    <w:p>
-      <w:pPr>
-        <w:pStyle w:val="Guidage"/>
-        <w:rPr>
-          <w:color w:val="808080" w:themeColor="background1" w:themeShade="80"/>
-        </w:rPr>
-      </w:pPr>
-      <w:r>
-        <w:rPr>
-          <w:color w:val="808080" w:themeColor="background1" w:themeShade="80"/>
-        </w:rPr>
-        <w:t xml:space="preserve">Exemple </w:t>
-      </w:r>
-      <w:r>
-        <w:rPr>
-          <w:color w:val="808080" w:themeColor="background1" w:themeShade="80"/>
-        </w:rPr>
-        <w:t>de contenu attendu :</w:t>
-      </w:r>
-    </w:p>
-    <w:p>
-      <w:pPr>
-        <w:pStyle w:val="GuidageList"/>
-        <w:numPr>
-          <w:ilvl w:val="0"/>
-          <w:numId w:val="0"/>
-        </w:numPr>
-      </w:pPr>
-      <w:r>
-        <w:t>Risques techniques</w:t>
-      </w:r>
-    </w:p>
-    <w:p>
-      <w:pPr>
-        <w:pStyle w:val="GuidageList"/>
-        <w:numPr>
-          <w:ilvl w:val="0"/>
-          <w:numId w:val="0"/>
-        </w:numPr>
-      </w:pPr>
-      <w:r>
-        <w:t>Risques organisationnels</w:t>
-      </w:r>
-    </w:p>
-    <w:p>
-      <w:r>
-        <w:rPr>
-          <w:i/>
-          <w:iCs/>
-          <w:color w:val="787878"/>
-        </w:rPr>
-        <w:t>À rédiger…</w:t>
-      </w:r>
+        <w:sectPr>
+          <w:type w:val="continuous"/>
+          <w:pgSz w:w="12240" w:h="15840"/>
+          <w:pgMar w:top="1386" w:right="1417" w:bottom="618" w:left="1417" w:header="720" w:footer="188" w:gutter="0"/>
+          <w:cols w:space="720"/>
+          <w:titlePg/>
+          <w:docGrid w:linePitch="360"/>
+        </w:sectPr>
+      </w:pPr>
     </w:p>
     <w:p/>
     <w:p>
       <w:pPr>
         <w:pStyle w:val="Titre2"/>
       </w:pPr>
-      <w:bookmarkStart w:id="5" w:name="_Toc223007765"/>
-      <w:r>
-        <w:t>Conception</w:t>
-      </w:r>
-      <w:bookmarkEnd w:id="5"/>
-    </w:p>
-    <w:p>
-      <w:pPr>
-        <w:pStyle w:val="Guidage"/>
-      </w:pPr>
-      <w:r>
-        <w:t xml:space="preserve">Exemple </w:t>
-      </w:r>
-      <w:r>
-        <w:t>de contenu attendu :</w:t>
-      </w:r>
-    </w:p>
-    <w:p>
-      <w:pPr>
-        <w:pStyle w:val="GuidageList"/>
-        <w:numPr>
-          <w:ilvl w:val="0"/>
-          <w:numId w:val="0"/>
-        </w:numPr>
-      </w:pPr>
-      <w:r>
-        <w:t>Architecture (schéma de haut niveau)</w:t>
-      </w:r>
-    </w:p>
-    <w:p>
-      <w:pPr>
-        <w:pStyle w:val="GuidageList"/>
-        <w:numPr>
-          <w:ilvl w:val="0"/>
-          <w:numId w:val="0"/>
-        </w:numPr>
-      </w:pPr>
-      <w:r>
-        <w:t>Conception détaillée (</w:t>
-      </w:r>
-      <w:r>
-        <w:t>MCD</w:t>
-      </w:r>
-      <w:r>
-        <w:t xml:space="preserve">, </w:t>
-      </w:r>
-      <w:r>
-        <w:t>UML</w:t>
-      </w:r>
-      <w:r>
-        <w:t xml:space="preserve">, </w:t>
-      </w:r>
-      <w:r>
-        <w:t xml:space="preserve">schéma </w:t>
-      </w:r>
-      <w:r>
-        <w:t>fonctionnel</w:t>
-      </w:r>
-      <w:r>
-        <w:t>,</w:t>
-      </w:r>
-      <w:r>
-        <w:t xml:space="preserve"> API, maquettes UI</w:t>
-      </w:r>
-      <w:r>
-        <w:t>,</w:t>
-      </w:r>
-      <w:r>
-        <w:t xml:space="preserve"> </w:t>
-      </w:r>
-      <w:r>
-        <w:t>etc.</w:t>
-      </w:r>
-      <w:r>
-        <w:t>)</w:t>
-      </w:r>
-    </w:p>
-    <w:p>
-      <w:pPr>
-        <w:pStyle w:val="GuidageList"/>
-        <w:numPr>
-          <w:ilvl w:val="0"/>
-          <w:numId w:val="0"/>
-        </w:numPr>
-      </w:pPr>
-      <w:r>
-        <w:t>Choix techniques et alternatives évaluées</w:t>
-      </w:r>
-    </w:p>
-    <w:p>
-      <w:pPr>
-        <w:pStyle w:val="GuidageList"/>
-        <w:numPr>
-          <w:ilvl w:val="0"/>
-          <w:numId w:val="0"/>
-        </w:numPr>
-      </w:pPr>
-      <w:r>
-        <w:t>Sécurité : authentification, autorisations, gestion des secrets</w:t>
-      </w:r>
-      <w:r>
-        <w:t xml:space="preserve">, firewall, </w:t>
-      </w:r>
-      <w:r>
-        <w:t>protocole</w:t>
-      </w:r>
-      <w:r>
-        <w:t xml:space="preserve"> </w:t>
-      </w:r>
-    </w:p>
-    <w:p>
-      <w:r>
-        <w:rPr>
-          <w:i/>
-          <w:iCs/>
-          <w:color w:val="787878"/>
-        </w:rPr>
-        <w:lastRenderedPageBreak/>
-        <w:t>À rédiger…</w:t>
-      </w:r>
-    </w:p>
-    <w:p/>
-    <w:p>
-      <w:pPr>
-        <w:pStyle w:val="Titre2"/>
-      </w:pPr>
       <w:bookmarkStart w:id="6" w:name="_Toc223007766"/>
       <w:r>
         <w:t>Planification et suivi</w:t>
@@ -3342,95 +3477,122 @@
     </w:p>
     <w:p>
       <w:pPr>
-        <w:pStyle w:val="Guidage"/>
-      </w:pPr>
-      <w:r>
-        <w:t xml:space="preserve">Exemple </w:t>
-      </w:r>
-      <w:r>
-        <w:t>de contenu attendu :</w:t>
+        <w:keepNext/>
+        <w:jc w:val="center"/>
+      </w:pPr>
+      <w:r>
+        <w:rPr>
+          <w:noProof/>
+        </w:rPr>
+        <w:drawing>
+          <wp:inline distT="0" distB="0" distL="0" distR="0" wp14:anchorId="2D22B945" wp14:editId="06D07664">
+            <wp:extent cx="9227185" cy="2867025"/>
+            <wp:effectExtent l="19050" t="19050" r="12065" b="28575"/>
+            <wp:docPr id="1098196285" name="Image 1"/>
+            <wp:cNvGraphicFramePr>
+              <a:graphicFrameLocks xmlns:a="http://schemas.openxmlformats.org/drawingml/2006/main" noChangeAspect="1"/>
+            </wp:cNvGraphicFramePr>
+            <a:graphic xmlns:a="http://schemas.openxmlformats.org/drawingml/2006/main">
+              <a:graphicData uri="http://schemas.openxmlformats.org/drawingml/2006/picture">
+                <pic:pic xmlns:pic="http://schemas.openxmlformats.org/drawingml/2006/picture">
+                  <pic:nvPicPr>
+                    <pic:cNvPr id="0" name="Picture 1"/>
+                    <pic:cNvPicPr>
+                      <a:picLocks noChangeAspect="1" noChangeArrowheads="1"/>
+                    </pic:cNvPicPr>
+                  </pic:nvPicPr>
+                  <pic:blipFill rotWithShape="1">
+                    <a:blip r:embed="rId18">
+                      <a:extLst>
+                        <a:ext uri="{28A0092B-C50C-407E-A947-70E740481C1C}">
+                          <a14:useLocalDpi xmlns:a14="http://schemas.microsoft.com/office/drawing/2010/main" val="0"/>
+                        </a:ext>
+                      </a:extLst>
+                    </a:blip>
+                    <a:srcRect b="2901"/>
+                    <a:stretch>
+                      <a:fillRect/>
+                    </a:stretch>
+                  </pic:blipFill>
+                  <pic:spPr bwMode="auto">
+                    <a:xfrm>
+                      <a:off x="0" y="0"/>
+                      <a:ext cx="9230729" cy="2868126"/>
+                    </a:xfrm>
+                    <a:prstGeom prst="rect">
+                      <a:avLst/>
+                    </a:prstGeom>
+                    <a:noFill/>
+                    <a:ln w="9525" cap="flat" cmpd="sng" algn="ctr">
+                      <a:solidFill>
+                        <a:sysClr val="window" lastClr="FFFFFF">
+                          <a:lumMod val="75000"/>
+                        </a:sysClr>
+                      </a:solidFill>
+                      <a:prstDash val="solid"/>
+                      <a:round/>
+                      <a:headEnd type="none" w="med" len="med"/>
+                      <a:tailEnd type="none" w="med" len="med"/>
+                      <a:extLst>
+                        <a:ext uri="{C807C97D-BFC1-408E-A445-0C87EB9F89A2}">
+                          <ask:lineSketchStyleProps xmlns:ask="http://schemas.microsoft.com/office/drawing/2018/sketchyshapes" sd="0">
+                            <a:custGeom>
+                              <a:avLst/>
+                              <a:gdLst/>
+                              <a:ahLst/>
+                              <a:cxnLst/>
+                              <a:rect l="0" t="0" r="0" b="0"/>
+                              <a:pathLst/>
+                            </a:custGeom>
+                            <ask:type/>
+                          </ask:lineSketchStyleProps>
+                        </a:ext>
+                      </a:extLst>
+                    </a:ln>
+                    <a:extLst>
+                      <a:ext uri="{53640926-AAD7-44D8-BBD7-CCE9431645EC}">
+                        <a14:shadowObscured xmlns:a14="http://schemas.microsoft.com/office/drawing/2010/main"/>
+                      </a:ext>
+                    </a:extLst>
+                  </pic:spPr>
+                </pic:pic>
+              </a:graphicData>
+            </a:graphic>
+          </wp:inline>
+        </w:drawing>
       </w:r>
     </w:p>
     <w:p>
       <w:pPr>
-        <w:pStyle w:val="GuidageList"/>
-        <w:numPr>
-          <w:ilvl w:val="0"/>
-          <w:numId w:val="0"/>
-        </w:numPr>
-      </w:pPr>
-      <w:r>
-        <w:t xml:space="preserve">Planification initiale (jalons, </w:t>
-      </w:r>
-      <w:r>
-        <w:t>Gantt, tâches, date de début / fin, Milestone</w:t>
-      </w:r>
-      <w:r>
-        <w:t>)</w:t>
+        <w:pStyle w:val="Lgende"/>
+        <w:jc w:val="center"/>
+      </w:pPr>
+      <w:r>
+        <w:t xml:space="preserve">Figure </w:t>
+      </w:r>
+      <w:r>
+        <w:fldChar w:fldCharType="begin"/>
+      </w:r>
+      <w:r>
+        <w:instrText xml:space="preserve"> SEQ Figure \* ARABIC </w:instrText>
+      </w:r>
+      <w:r>
+        <w:fldChar w:fldCharType="separate"/>
+      </w:r>
+      <w:r>
+        <w:rPr>
+          <w:noProof/>
+        </w:rPr>
+        <w:t>1</w:t>
+      </w:r>
+      <w:r>
+        <w:fldChar w:fldCharType="end"/>
+      </w:r>
+      <w:r>
+        <w:t>. Planification initiale</w:t>
       </w:r>
     </w:p>
-    <w:p>
-      <w:pPr>
-        <w:pStyle w:val="GuidageList"/>
-        <w:numPr>
-          <w:ilvl w:val="0"/>
-          <w:numId w:val="0"/>
-        </w:numPr>
-      </w:pPr>
-      <w:r>
-        <w:t>Planification révisée et écarts (</w:t>
-      </w:r>
-      <w:r>
-        <w:t xml:space="preserve">explications </w:t>
-      </w:r>
-      <w:r>
-        <w:t>causes + actions)</w:t>
-      </w:r>
-    </w:p>
-    <w:p>
-      <w:pPr>
-        <w:pStyle w:val="GuidageList"/>
-        <w:numPr>
-          <w:ilvl w:val="0"/>
-          <w:numId w:val="0"/>
-        </w:numPr>
-      </w:pPr>
-      <w:r>
-        <w:t>Suivi : indicateurs, décisions, changements importants</w:t>
-      </w:r>
-    </w:p>
-    <w:p>
-      <w:pPr>
-        <w:pStyle w:val="GuidageList"/>
-        <w:numPr>
-          <w:ilvl w:val="0"/>
-          <w:numId w:val="0"/>
-        </w:numPr>
-      </w:pPr>
-      <w:r>
-        <w:t xml:space="preserve">Pour des questions de place, le journal de travail sera mentionné en </w:t>
-      </w:r>
-      <w:r>
-        <w:t>annexe.</w:t>
-      </w:r>
-    </w:p>
-    <w:p>
-      <w:pPr>
-        <w:rPr>
-          <w:i/>
-          <w:iCs/>
-          <w:color w:val="787878"/>
-        </w:rPr>
-      </w:pPr>
-      <w:r>
-        <w:rPr>
-          <w:i/>
-          <w:iCs/>
-          <w:color w:val="787878"/>
-        </w:rPr>
-        <w:t>À rédiger…</w:t>
-      </w:r>
-    </w:p>
+    <w:p/>
     <w:p>
       <w:r>
         <w:t>Le</w:t>
@@ -3511,6 +3673,18 @@
         <w:t>.</w:t>
       </w:r>
     </w:p>
+    <w:p>
+      <w:pPr>
+        <w:sectPr>
+          <w:pgSz w:w="15840" w:h="12240" w:orient="landscape"/>
+          <w:pgMar w:top="1417" w:right="1386" w:bottom="1417" w:left="618" w:header="720" w:footer="188" w:gutter="0"/>
+          <w:cols w:space="720"/>
+          <w:titlePg/>
+          <w:docGrid w:linePitch="360"/>
+        </w:sectPr>
+      </w:pPr>
+    </w:p>
+    <w:p/>
     <w:p/>
     <w:p>
       <w:pPr>
@@ -3895,7 +4069,6 @@
         </w:numPr>
       </w:pPr>
       <w:r>
-        <w:lastRenderedPageBreak/>
         <w:t>Procédure de livraison (packaging, images Docker, artefacts</w:t>
       </w:r>
       <w:r>
@@ -4000,6 +4173,7 @@
         </w:numPr>
       </w:pPr>
       <w:r>
+        <w:lastRenderedPageBreak/>
         <w:t>Difficultés rencontrées et solutions</w:t>
       </w:r>
     </w:p>
@@ -4172,7 +4346,15 @@
         <w:t xml:space="preserve"> : </w:t>
       </w:r>
       <w:r>
-        <w:t>fichiers .env, variables, secrets - sans divulguer de secrets)</w:t>
+        <w:t>fichiers .</w:t>
+      </w:r>
+      <w:proofErr w:type="spellStart"/>
+      <w:r>
+        <w:t>env</w:t>
+      </w:r>
+      <w:proofErr w:type="spellEnd"/>
+      <w:r>
+        <w:t>, variables, secrets - sans divulguer de secrets)</w:t>
       </w:r>
     </w:p>
     <w:p>
@@ -4652,10 +4834,6 @@
     <w:p>
       <w:pPr>
         <w:pStyle w:val="Titre2"/>
-        <w:numPr>
-          <w:ilvl w:val="0"/>
-          <w:numId w:val="23"/>
-        </w:numPr>
       </w:pPr>
       <w:bookmarkStart w:id="24" w:name="_Ref223003988"/>
       <w:bookmarkStart w:id="25" w:name="_Ref223003991"/>
@@ -4906,10 +5084,6 @@
     <w:p>
       <w:pPr>
         <w:pStyle w:val="Titre2"/>
-        <w:numPr>
-          <w:ilvl w:val="0"/>
-          <w:numId w:val="23"/>
-        </w:numPr>
       </w:pPr>
       <w:bookmarkStart w:id="28" w:name="_Toc223007784"/>
       <w:r>
@@ -4949,10 +5123,6 @@
     <w:p>
       <w:pPr>
         <w:pStyle w:val="Titre2"/>
-        <w:numPr>
-          <w:ilvl w:val="0"/>
-          <w:numId w:val="23"/>
-        </w:numPr>
       </w:pPr>
       <w:bookmarkStart w:id="29" w:name="_Toc223007785"/>
       <w:r>
@@ -5859,9 +6029,6 @@
       </w:r>
     </w:p>
     <w:sectPr>
-      <w:headerReference w:type="default" r:id="rId13"/>
-      <w:footerReference w:type="even" r:id="rId14"/>
-      <w:footerReference w:type="default" r:id="rId15"/>
       <w:pgSz w:w="12240" w:h="15840"/>
       <w:pgMar w:top="1386" w:right="1417" w:bottom="618" w:left="1417" w:header="720" w:footer="188" w:gutter="0"/>
       <w:cols w:space="720"/>
@@ -6183,6 +6350,276 @@
           <w:r>
             <w:rPr>
               <w:rFonts w:asciiTheme="majorHAnsi" w:hAnsiTheme="majorHAnsi" w:cstheme="majorHAnsi"/>
+              <w:noProof/>
+            </w:rPr>
+            <w:t>27/04/2026</w:t>
+          </w:r>
+          <w:r>
+            <w:rPr>
+              <w:rFonts w:asciiTheme="majorHAnsi" w:hAnsiTheme="majorHAnsi" w:cstheme="majorHAnsi"/>
+            </w:rPr>
+            <w:fldChar w:fldCharType="end"/>
+          </w:r>
+          <w:r>
+            <w:rPr>
+              <w:rFonts w:asciiTheme="majorHAnsi" w:hAnsiTheme="majorHAnsi" w:cstheme="majorHAnsi"/>
+            </w:rPr>
+            <w:t xml:space="preserve"> </w:t>
+          </w:r>
+        </w:p>
+      </w:tc>
+    </w:tr>
+  </w:tbl>
+  <w:p>
+    <w:pPr>
+      <w:pStyle w:val="Pieddepage"/>
+    </w:pPr>
+  </w:p>
+</w:ftr>
+</file>
+
+<file path=word/footer3.xml><?xml version="1.0" encoding="utf-8"?>
+<w:ftr xmlns:wpc="http://schemas.microsoft.com/office/word/2010/wordprocessingCanvas" xmlns:cx="http://schemas.microsoft.com/office/drawing/2014/chartex" xmlns:cx1="http://schemas.microsoft.com/office/drawing/2015/9/8/chartex" xmlns:cx2="http://schemas.microsoft.com/office/drawing/2015/10/21/chartex" xmlns:cx3="http://schemas.microsoft.com/office/drawing/2016/5/9/chartex" xmlns:cx4="http://schemas.microsoft.com/office/drawing/2016/5/10/chartex" xmlns:cx5="http://schemas.microsoft.com/office/drawing/2016/5/11/chartex" xmlns:cx6="http://schemas.microsoft.com/office/drawing/2016/5/12/chartex" xmlns:cx7="http://schemas.microsoft.com/office/drawing/2016/5/13/chartex" xmlns:cx8="http://schemas.microsoft.com/office/drawing/2016/5/14/chartex" xmlns:mc="http://schemas.openxmlformats.org/markup-compatibility/2006" xmlns:aink="http://schemas.microsoft.com/office/drawing/2016/ink" xmlns:am3d="http://schemas.microsoft.com/office/drawing/2017/model3d" xmlns:o="urn:schemas-microsoft-com:office:office" xmlns:oel="http://schemas.microsoft.com/office/2019/extlst" xmlns:r="http://schemas.openxmlformats.org/officeDocument/2006/relationships" xmlns:m="http://schemas.openxmlformats.org/officeDocument/2006/math" xmlns:v="urn:schemas-microsoft-com:vml" xmlns:wp14="http://schemas.microsoft.com/office/word/2010/wordprocessingDrawing" xmlns:wp="http://schemas.openxmlformats.org/drawingml/2006/wordprocessingDrawing" xmlns:w10="urn:schemas-microsoft-com:office:word" xmlns:w="http://schemas.openxmlformats.org/wordprocessingml/2006/main" xmlns:w14="http://schemas.microsoft.com/office/word/2010/wordml" xmlns:w15="http://schemas.microsoft.com/office/word/2012/wordml" xmlns:w16cex="http://schemas.microsoft.com/office/word/2018/wordml/cex" xmlns:w16cid="http://schemas.microsoft.com/office/word/2016/wordml/cid" xmlns:w16="http://schemas.microsoft.com/office/word/2018/wordml" xmlns:w16du="http://schemas.microsoft.com/office/word/2023/wordml/word16du" xmlns:w16sdtdh="http://schemas.microsoft.com/office/word/2020/wordml/sdtdatahash" xmlns:w16sdtfl="http://schemas.microsoft.com/office/word/2024/wordml/sdtformatlock" xmlns:w16se="http://schemas.microsoft.com/office/word/2015/wordml/symex" xmlns:wpg="http://schemas.microsoft.com/office/word/2010/wordprocessingGroup" xmlns:wpi="http://schemas.microsoft.com/office/word/2010/wordprocessingInk" xmlns:wne="http://schemas.microsoft.com/office/word/2006/wordml" xmlns:wps="http://schemas.microsoft.com/office/word/2010/wordprocessingShape" mc:Ignorable="w14 w15 w16se w16cid w16 w16cex w16sdtdh w16sdtfl w16du wp14">
+  <w:tbl>
+    <w:tblPr>
+      <w:tblStyle w:val="Grilledutableau"/>
+      <w:tblW w:w="0" w:type="auto"/>
+      <w:jc w:val="center"/>
+      <w:tblBorders>
+        <w:left w:val="none" w:sz="0" w:space="0" w:color="auto"/>
+        <w:bottom w:val="none" w:sz="0" w:space="0" w:color="auto"/>
+        <w:right w:val="none" w:sz="0" w:space="0" w:color="auto"/>
+        <w:insideH w:val="none" w:sz="0" w:space="0" w:color="auto"/>
+        <w:insideV w:val="none" w:sz="0" w:space="0" w:color="auto"/>
+      </w:tblBorders>
+      <w:tblLook w:val="04A0" w:firstRow="1" w:lastRow="0" w:firstColumn="1" w:lastColumn="0" w:noHBand="0" w:noVBand="1"/>
+    </w:tblPr>
+    <w:tblGrid>
+      <w:gridCol w:w="9396"/>
+    </w:tblGrid>
+    <w:tr>
+      <w:trPr>
+        <w:jc w:val="center"/>
+      </w:trPr>
+      <w:tc>
+        <w:tcPr>
+          <w:tcW w:w="9396" w:type="dxa"/>
+        </w:tcPr>
+        <w:p>
+          <w:pPr>
+            <w:pStyle w:val="Pieddepage"/>
+            <w:jc w:val="center"/>
+          </w:pPr>
+          <w:sdt>
+            <w:sdtPr>
+              <w:rPr>
+                <w:rStyle w:val="Numrodepage"/>
+              </w:rPr>
+              <w:id w:val="-1450466350"/>
+              <w:docPartObj>
+                <w:docPartGallery w:val="Page Numbers (Bottom of Page)"/>
+                <w:docPartUnique/>
+              </w:docPartObj>
+            </w:sdtPr>
+            <w:sdtContent>
+              <w:r>
+                <w:rPr>
+                  <w:rStyle w:val="Numrodepage"/>
+                </w:rPr>
+                <w:fldChar w:fldCharType="begin"/>
+              </w:r>
+              <w:r>
+                <w:rPr>
+                  <w:rStyle w:val="Numrodepage"/>
+                </w:rPr>
+                <w:instrText xml:space="preserve"> PAGE </w:instrText>
+              </w:r>
+              <w:r>
+                <w:rPr>
+                  <w:rStyle w:val="Numrodepage"/>
+                </w:rPr>
+                <w:fldChar w:fldCharType="separate"/>
+              </w:r>
+              <w:r>
+                <w:rPr>
+                  <w:rStyle w:val="Numrodepage"/>
+                </w:rPr>
+                <w:t>6</w:t>
+              </w:r>
+              <w:r>
+                <w:rPr>
+                  <w:rStyle w:val="Numrodepage"/>
+                </w:rPr>
+                <w:fldChar w:fldCharType="end"/>
+              </w:r>
+              <w:r>
+                <w:rPr>
+                  <w:rStyle w:val="Numrodepage"/>
+                </w:rPr>
+                <w:t xml:space="preserve"> / </w:t>
+              </w:r>
+              <w:r>
+                <w:rPr>
+                  <w:rStyle w:val="Numrodepage"/>
+                </w:rPr>
+                <w:fldChar w:fldCharType="begin"/>
+              </w:r>
+              <w:r>
+                <w:rPr>
+                  <w:rStyle w:val="Numrodepage"/>
+                </w:rPr>
+                <w:instrText xml:space="preserve"> NUMPAGES  \* MERGEFORMAT </w:instrText>
+              </w:r>
+              <w:r>
+                <w:rPr>
+                  <w:rStyle w:val="Numrodepage"/>
+                </w:rPr>
+                <w:fldChar w:fldCharType="separate"/>
+              </w:r>
+              <w:r>
+                <w:rPr>
+                  <w:rStyle w:val="Numrodepage"/>
+                </w:rPr>
+                <w:t>14</w:t>
+              </w:r>
+              <w:r>
+                <w:rPr>
+                  <w:rStyle w:val="Numrodepage"/>
+                </w:rPr>
+                <w:fldChar w:fldCharType="end"/>
+              </w:r>
+            </w:sdtContent>
+          </w:sdt>
+        </w:p>
+      </w:tc>
+    </w:tr>
+  </w:tbl>
+  <w:tbl>
+    <w:tblPr>
+      <w:tblStyle w:val="Grilledutableau"/>
+      <w:tblW w:w="0" w:type="auto"/>
+      <w:jc w:val="center"/>
+      <w:tblBorders>
+        <w:left w:val="none" w:sz="0" w:space="0" w:color="auto"/>
+        <w:bottom w:val="none" w:sz="0" w:space="0" w:color="auto"/>
+        <w:right w:val="none" w:sz="0" w:space="0" w:color="auto"/>
+        <w:insideH w:val="none" w:sz="0" w:space="0" w:color="auto"/>
+        <w:insideV w:val="none" w:sz="0" w:space="0" w:color="auto"/>
+      </w:tblBorders>
+      <w:tblLook w:val="04A0" w:firstRow="1" w:lastRow="0" w:firstColumn="1" w:lastColumn="0" w:noHBand="0" w:noVBand="1"/>
+    </w:tblPr>
+    <w:tblGrid>
+      <w:gridCol w:w="3132"/>
+      <w:gridCol w:w="3132"/>
+      <w:gridCol w:w="3132"/>
+    </w:tblGrid>
+    <w:tr>
+      <w:trPr>
+        <w:jc w:val="center"/>
+      </w:trPr>
+      <w:tc>
+        <w:tcPr>
+          <w:tcW w:w="3132" w:type="dxa"/>
+        </w:tcPr>
+        <w:p>
+          <w:pPr>
+            <w:pStyle w:val="Pieddepage"/>
+            <w:rPr>
+              <w:rFonts w:asciiTheme="majorHAnsi" w:hAnsiTheme="majorHAnsi" w:cstheme="majorHAnsi"/>
+            </w:rPr>
+          </w:pPr>
+          <w:r>
+            <w:rPr>
+              <w:rFonts w:asciiTheme="majorHAnsi" w:hAnsiTheme="majorHAnsi" w:cstheme="majorHAnsi"/>
+            </w:rPr>
+            <w:t xml:space="preserve">Candidat : </w:t>
+          </w:r>
+          <w:r>
+            <w:rPr>
+              <w:rFonts w:asciiTheme="majorHAnsi" w:hAnsiTheme="majorHAnsi" w:cstheme="majorHAnsi"/>
+            </w:rPr>
+            <w:fldChar w:fldCharType="begin"/>
+          </w:r>
+          <w:r>
+            <w:rPr>
+              <w:rFonts w:asciiTheme="majorHAnsi" w:hAnsiTheme="majorHAnsi" w:cstheme="majorHAnsi"/>
+            </w:rPr>
+            <w:instrText xml:space="preserve"> PRINT  \* MERGEFORMAT </w:instrText>
+          </w:r>
+          <w:r>
+            <w:rPr>
+              <w:rFonts w:asciiTheme="majorHAnsi" w:hAnsiTheme="majorHAnsi" w:cstheme="majorHAnsi"/>
+            </w:rPr>
+            <w:fldChar w:fldCharType="separate"/>
+          </w:r>
+          <w:r>
+            <w:rPr>
+              <w:rFonts w:asciiTheme="majorHAnsi" w:hAnsiTheme="majorHAnsi" w:cstheme="majorHAnsi"/>
+            </w:rPr>
+            <w:fldChar w:fldCharType="end"/>
+          </w:r>
+          <w:r>
+            <w:rPr>
+              <w:rFonts w:asciiTheme="majorHAnsi" w:hAnsiTheme="majorHAnsi" w:cstheme="majorHAnsi"/>
+            </w:rPr>
+            <w:t xml:space="preserve"> </w:t>
+          </w:r>
+        </w:p>
+      </w:tc>
+      <w:tc>
+        <w:tcPr>
+          <w:tcW w:w="3132" w:type="dxa"/>
+        </w:tcPr>
+        <w:p>
+          <w:pPr>
+            <w:pStyle w:val="Pieddepage"/>
+            <w:jc w:val="center"/>
+            <w:rPr>
+              <w:rFonts w:asciiTheme="majorHAnsi" w:hAnsiTheme="majorHAnsi" w:cstheme="majorHAnsi"/>
+            </w:rPr>
+          </w:pPr>
+        </w:p>
+      </w:tc>
+      <w:tc>
+        <w:tcPr>
+          <w:tcW w:w="3132" w:type="dxa"/>
+        </w:tcPr>
+        <w:p>
+          <w:pPr>
+            <w:pStyle w:val="Pieddepage"/>
+            <w:jc w:val="right"/>
+            <w:rPr>
+              <w:rFonts w:asciiTheme="majorHAnsi" w:hAnsiTheme="majorHAnsi" w:cstheme="majorHAnsi"/>
+            </w:rPr>
+          </w:pPr>
+          <w:r>
+            <w:rPr>
+              <w:rFonts w:asciiTheme="majorHAnsi" w:hAnsiTheme="majorHAnsi" w:cstheme="majorHAnsi"/>
+            </w:rPr>
+            <w:t>Imprimé le </w:t>
+          </w:r>
+          <w:r>
+            <w:rPr>
+              <w:rFonts w:asciiTheme="majorHAnsi" w:hAnsiTheme="majorHAnsi" w:cstheme="majorHAnsi"/>
+            </w:rPr>
+            <w:fldChar w:fldCharType="begin"/>
+          </w:r>
+          <w:r>
+            <w:rPr>
+              <w:rFonts w:asciiTheme="majorHAnsi" w:hAnsiTheme="majorHAnsi" w:cstheme="majorHAnsi"/>
+            </w:rPr>
+            <w:instrText xml:space="preserve"> DATE  \@ "dd/MM/yyyy"  \* MERGEFORMAT </w:instrText>
+          </w:r>
+          <w:r>
+            <w:rPr>
+              <w:rFonts w:asciiTheme="majorHAnsi" w:hAnsiTheme="majorHAnsi" w:cstheme="majorHAnsi"/>
+            </w:rPr>
+            <w:fldChar w:fldCharType="separate"/>
+          </w:r>
+          <w:r>
+            <w:rPr>
+              <w:rFonts w:asciiTheme="majorHAnsi" w:hAnsiTheme="majorHAnsi" w:cstheme="majorHAnsi"/>
+              <w:noProof/>
             </w:rPr>
             <w:t>27/04/2026</w:t>
           </w:r>
@@ -6307,6 +6744,131 @@
       </w:tc>
     </w:tr>
     <w:tr>
+      <w:tc>
+        <w:tcPr>
+          <w:tcW w:w="2263" w:type="dxa"/>
+        </w:tcPr>
+        <w:p>
+          <w:pPr>
+            <w:pStyle w:val="En-tte"/>
+          </w:pPr>
+        </w:p>
+      </w:tc>
+      <w:tc>
+        <w:tcPr>
+          <w:tcW w:w="5103" w:type="dxa"/>
+        </w:tcPr>
+        <w:p>
+          <w:pPr>
+            <w:pStyle w:val="En-tte"/>
+            <w:jc w:val="center"/>
+            <w:rPr>
+              <w:b/>
+              <w:bCs/>
+            </w:rPr>
+          </w:pPr>
+        </w:p>
+      </w:tc>
+      <w:tc>
+        <w:tcPr>
+          <w:tcW w:w="2030" w:type="dxa"/>
+        </w:tcPr>
+        <w:p>
+          <w:pPr>
+            <w:pStyle w:val="En-tte"/>
+            <w:jc w:val="right"/>
+          </w:pPr>
+        </w:p>
+      </w:tc>
+    </w:tr>
+  </w:tbl>
+  <w:p>
+    <w:pPr>
+      <w:pStyle w:val="En-tte"/>
+    </w:pPr>
+  </w:p>
+</w:hdr>
+</file>
+
+<file path=word/header2.xml><?xml version="1.0" encoding="utf-8"?>
+<w:hdr xmlns:wpc="http://schemas.microsoft.com/office/word/2010/wordprocessingCanvas" xmlns:cx="http://schemas.microsoft.com/office/drawing/2014/chartex" xmlns:cx1="http://schemas.microsoft.com/office/drawing/2015/9/8/chartex" xmlns:cx2="http://schemas.microsoft.com/office/drawing/2015/10/21/chartex" xmlns:cx3="http://schemas.microsoft.com/office/drawing/2016/5/9/chartex" xmlns:cx4="http://schemas.microsoft.com/office/drawing/2016/5/10/chartex" xmlns:cx5="http://schemas.microsoft.com/office/drawing/2016/5/11/chartex" xmlns:cx6="http://schemas.microsoft.com/office/drawing/2016/5/12/chartex" xmlns:cx7="http://schemas.microsoft.com/office/drawing/2016/5/13/chartex" xmlns:cx8="http://schemas.microsoft.com/office/drawing/2016/5/14/chartex" xmlns:mc="http://schemas.openxmlformats.org/markup-compatibility/2006" xmlns:aink="http://schemas.microsoft.com/office/drawing/2016/ink" xmlns:am3d="http://schemas.microsoft.com/office/drawing/2017/model3d" xmlns:o="urn:schemas-microsoft-com:office:office" xmlns:oel="http://schemas.microsoft.com/office/2019/extlst" xmlns:r="http://schemas.openxmlformats.org/officeDocument/2006/relationships" xmlns:m="http://schemas.openxmlformats.org/officeDocument/2006/math" xmlns:v="urn:schemas-microsoft-com:vml" xmlns:wp14="http://schemas.microsoft.com/office/word/2010/wordprocessingDrawing" xmlns:wp="http://schemas.openxmlformats.org/drawingml/2006/wordprocessingDrawing" xmlns:w10="urn:schemas-microsoft-com:office:word" xmlns:w="http://schemas.openxmlformats.org/wordprocessingml/2006/main" xmlns:w14="http://schemas.microsoft.com/office/word/2010/wordml" xmlns:w15="http://schemas.microsoft.com/office/word/2012/wordml" xmlns:w16cex="http://schemas.microsoft.com/office/word/2018/wordml/cex" xmlns:w16cid="http://schemas.microsoft.com/office/word/2016/wordml/cid" xmlns:w16="http://schemas.microsoft.com/office/word/2018/wordml" xmlns:w16du="http://schemas.microsoft.com/office/word/2023/wordml/word16du" xmlns:w16sdtdh="http://schemas.microsoft.com/office/word/2020/wordml/sdtdatahash" xmlns:w16sdtfl="http://schemas.microsoft.com/office/word/2024/wordml/sdtformatlock" xmlns:w16se="http://schemas.microsoft.com/office/word/2015/wordml/symex" xmlns:wpg="http://schemas.microsoft.com/office/word/2010/wordprocessingGroup" xmlns:wpi="http://schemas.microsoft.com/office/word/2010/wordprocessingInk" xmlns:wne="http://schemas.microsoft.com/office/word/2006/wordml" xmlns:wps="http://schemas.microsoft.com/office/word/2010/wordprocessingShape" mc:Ignorable="w14 w15 w16se w16cid w16 w16cex w16sdtdh w16sdtfl w16du wp14">
+  <w:tbl>
+    <w:tblPr>
+      <w:tblStyle w:val="Grilledutableau"/>
+      <w:tblW w:w="0" w:type="auto"/>
+      <w:jc w:val="center"/>
+      <w:tblBorders>
+        <w:top w:val="none" w:sz="0" w:space="0" w:color="auto"/>
+        <w:left w:val="none" w:sz="0" w:space="0" w:color="auto"/>
+        <w:right w:val="none" w:sz="0" w:space="0" w:color="auto"/>
+        <w:insideH w:val="none" w:sz="0" w:space="0" w:color="auto"/>
+        <w:insideV w:val="none" w:sz="0" w:space="0" w:color="auto"/>
+      </w:tblBorders>
+      <w:tblLook w:val="04A0" w:firstRow="1" w:lastRow="0" w:firstColumn="1" w:lastColumn="0" w:noHBand="0" w:noVBand="1"/>
+    </w:tblPr>
+    <w:tblGrid>
+      <w:gridCol w:w="2263"/>
+      <w:gridCol w:w="5103"/>
+      <w:gridCol w:w="2030"/>
+    </w:tblGrid>
+    <w:tr>
+      <w:trPr>
+        <w:jc w:val="center"/>
+      </w:trPr>
+      <w:tc>
+        <w:tcPr>
+          <w:tcW w:w="2263" w:type="dxa"/>
+        </w:tcPr>
+        <w:p>
+          <w:pPr>
+            <w:pStyle w:val="En-tte"/>
+          </w:pPr>
+          <w:r>
+            <w:t>CFC Informaticien</w:t>
+          </w:r>
+        </w:p>
+      </w:tc>
+      <w:tc>
+        <w:tcPr>
+          <w:tcW w:w="5103" w:type="dxa"/>
+        </w:tcPr>
+        <w:p>
+          <w:pPr>
+            <w:pStyle w:val="En-tte"/>
+            <w:jc w:val="center"/>
+            <w:rPr>
+              <w:b/>
+              <w:bCs/>
+            </w:rPr>
+          </w:pPr>
+          <w:r>
+            <w:rPr>
+              <w:b/>
+              <w:bCs/>
+            </w:rPr>
+            <w:t>Agora</w:t>
+          </w:r>
+        </w:p>
+      </w:tc>
+      <w:tc>
+        <w:tcPr>
+          <w:tcW w:w="2030" w:type="dxa"/>
+        </w:tcPr>
+        <w:p>
+          <w:pPr>
+            <w:pStyle w:val="En-tte"/>
+            <w:jc w:val="right"/>
+          </w:pPr>
+          <w:r>
+            <w:t>TPI</w:t>
+          </w:r>
+        </w:p>
+      </w:tc>
+    </w:tr>
+    <w:tr>
+      <w:trPr>
+        <w:jc w:val="center"/>
+      </w:trPr>
       <w:tc>
         <w:tcPr>
           <w:tcW w:w="2263" w:type="dxa"/>
@@ -9370,7 +9932,7 @@
   <w:style w:type="paragraph" w:default="1" w:styleId="Normal">
     <w:name w:val="Normal"/>
     <w:qFormat/>
-    <w:rsid w:val="00FC693F"/>
+    <w:rsid w:val="001A020B"/>
     <w:rPr>
       <w:rFonts w:ascii="Calibri" w:hAnsi="Calibri"/>
       <w:lang w:val="fr-FR"/>
@@ -9623,6 +10185,7 @@
   <w:style w:type="character" w:default="1" w:styleId="Policepardfaut">
     <w:name w:val="Default Paragraph Font"/>
     <w:uiPriority w:val="1"/>
+    <w:semiHidden/>
     <w:unhideWhenUsed/>
   </w:style>
   <w:style w:type="table" w:default="1" w:styleId="TableauNormal">
@@ -10193,7 +10756,6 @@
     <w:basedOn w:val="Normal"/>
     <w:next w:val="Normal"/>
     <w:uiPriority w:val="35"/>
-    <w:semiHidden/>
     <w:unhideWhenUsed/>
     <w:qFormat/>
     <w:rsid w:val="00FC693F"/>
@@ -21214,6 +21776,20 @@
 </file>
 
 <file path=customXml/item2.xml><?xml version="1.0" encoding="utf-8"?>
+<p:properties xmlns:p="http://schemas.microsoft.com/office/2006/metadata/properties" xmlns:xsi="http://www.w3.org/2001/XMLSchema-instance" xmlns:pc="http://schemas.microsoft.com/office/infopath/2007/PartnerControls">
+  <documentManagement>
+    <lcf76f155ced4ddcb4097134ff3c332f xmlns="ee5f0184-eb08-4677-9274-7b491257f1cd">
+      <Terms xmlns="http://schemas.microsoft.com/office/infopath/2007/PartnerControls"/>
+    </lcf76f155ced4ddcb4097134ff3c332f>
+  </documentManagement>
+</p:properties>
+</file>
+
+<file path=customXml/item3.xml><?xml version="1.0" encoding="utf-8"?>
+<b:Sources xmlns:b="http://schemas.openxmlformats.org/officeDocument/2006/bibliography" xmlns="http://schemas.openxmlformats.org/officeDocument/2006/bibliography" SelectedStyle="/APA.XSL" StyleName="APA"/>
+</file>
+
+<file path=customXml/item4.xml><?xml version="1.0" encoding="utf-8"?>
 <ct:contentTypeSchema xmlns:ct="http://schemas.microsoft.com/office/2006/metadata/contentType" xmlns:ma="http://schemas.microsoft.com/office/2006/metadata/properties/metaAttributes" ct:_="" ma:_="" ma:contentTypeName="Document" ma:contentTypeID="0x010100F51466D971E2C4468B98ED6E0A237706" ma:contentTypeVersion="9" ma:contentTypeDescription="Crée un document." ma:contentTypeScope="" ma:versionID="4b0dfbbe80d7261e27841c9058693058">
   <xsd:schema xmlns:xsd="http://www.w3.org/2001/XMLSchema" xmlns:xs="http://www.w3.org/2001/XMLSchema" xmlns:p="http://schemas.microsoft.com/office/2006/metadata/properties" xmlns:ns2="ee5f0184-eb08-4677-9274-7b491257f1cd" targetNamespace="http://schemas.microsoft.com/office/2006/metadata/properties" ma:root="true" ma:fieldsID="fb48af784c3f6b9554341c71f5645300" ns2:_="">
     <xsd:import namespace="ee5f0184-eb08-4677-9274-7b491257f1cd"/>
@@ -21385,20 +21961,6 @@
 </ct:contentTypeSchema>
 </file>
 
-<file path=customXml/item3.xml><?xml version="1.0" encoding="utf-8"?>
-<b:Sources xmlns:b="http://schemas.openxmlformats.org/officeDocument/2006/bibliography" xmlns="http://schemas.openxmlformats.org/officeDocument/2006/bibliography" SelectedStyle="/APA.XSL" StyleName="APA"/>
-</file>
-
-<file path=customXml/item4.xml><?xml version="1.0" encoding="utf-8"?>
-<p:properties xmlns:p="http://schemas.microsoft.com/office/2006/metadata/properties" xmlns:xsi="http://www.w3.org/2001/XMLSchema-instance" xmlns:pc="http://schemas.microsoft.com/office/infopath/2007/PartnerControls">
-  <documentManagement>
-    <lcf76f155ced4ddcb4097134ff3c332f xmlns="ee5f0184-eb08-4677-9274-7b491257f1cd">
-      <Terms xmlns="http://schemas.microsoft.com/office/infopath/2007/PartnerControls"/>
-    </lcf76f155ced4ddcb4097134ff3c332f>
-  </documentManagement>
-</p:properties>
-</file>
-
 <file path=customXml/itemProps1.xml><?xml version="1.0" encoding="utf-8"?>
 <ds:datastoreItem xmlns:ds="http://schemas.openxmlformats.org/officeDocument/2006/customXml" ds:itemID="{F7519688-DE67-4261-AE1F-7CA0E602FFE6}">
   <ds:schemaRefs>
@@ -21408,6 +21970,24 @@
 </file>
 
 <file path=customXml/itemProps2.xml><?xml version="1.0" encoding="utf-8"?>
+<ds:datastoreItem xmlns:ds="http://schemas.openxmlformats.org/officeDocument/2006/customXml" ds:itemID="{522E58A1-BBB0-4B64-A2D0-AC5C9A1CE564}">
+  <ds:schemaRefs>
+    <ds:schemaRef ds:uri="http://schemas.microsoft.com/office/2006/metadata/properties"/>
+    <ds:schemaRef ds:uri="http://schemas.microsoft.com/office/infopath/2007/PartnerControls"/>
+    <ds:schemaRef ds:uri="ee5f0184-eb08-4677-9274-7b491257f1cd"/>
+  </ds:schemaRefs>
+</ds:datastoreItem>
+</file>
+
+<file path=customXml/itemProps3.xml><?xml version="1.0" encoding="utf-8"?>
+<ds:datastoreItem xmlns:ds="http://schemas.openxmlformats.org/officeDocument/2006/customXml" ds:itemID="{EF278816-EC6F-A645-907D-7F25AECB1D4A}">
+  <ds:schemaRefs>
+    <ds:schemaRef ds:uri="http://schemas.openxmlformats.org/officeDocument/2006/bibliography"/>
+  </ds:schemaRefs>
+</ds:datastoreItem>
+</file>
+
+<file path=customXml/itemProps4.xml><?xml version="1.0" encoding="utf-8"?>
 <ds:datastoreItem xmlns:ds="http://schemas.openxmlformats.org/officeDocument/2006/customXml" ds:itemID="{78D34A46-9289-4E78-B763-2138A80FD031}">
   <ds:schemaRefs>
     <ds:schemaRef ds:uri="http://schemas.microsoft.com/office/2006/metadata/contentType"/>
@@ -21423,22 +22003,4 @@
     <ds:schemaRef ds:uri="http://schemas.microsoft.com/internal/obd"/>
   </ds:schemaRefs>
 </ds:datastoreItem>
-</file>
-
-<file path=customXml/itemProps3.xml><?xml version="1.0" encoding="utf-8"?>
-<ds:datastoreItem xmlns:ds="http://schemas.openxmlformats.org/officeDocument/2006/customXml" ds:itemID="{EF278816-EC6F-A645-907D-7F25AECB1D4A}">
-  <ds:schemaRefs>
-    <ds:schemaRef ds:uri="http://schemas.openxmlformats.org/officeDocument/2006/bibliography"/>
-  </ds:schemaRefs>
-</ds:datastoreItem>
-</file>
-
-<file path=customXml/itemProps4.xml><?xml version="1.0" encoding="utf-8"?>
-<ds:datastoreItem xmlns:ds="http://schemas.openxmlformats.org/officeDocument/2006/customXml" ds:itemID="{522E58A1-BBB0-4B64-A2D0-AC5C9A1CE564}">
-  <ds:schemaRefs>
-    <ds:schemaRef ds:uri="http://schemas.microsoft.com/office/2006/metadata/properties"/>
-    <ds:schemaRef ds:uri="http://schemas.microsoft.com/office/infopath/2007/PartnerControls"/>
-    <ds:schemaRef ds:uri="ee5f0184-eb08-4677-9274-7b491257f1cd"/>
-  </ds:schemaRefs>
-</ds:datastoreItem>
 </file>
</xml_diff>